<commit_message>
Brief: say 'potencjalny partner' instead of 'kandydat'
Co-Authored-By: Claude Opus 5.5 <noreply@anthropic.com>
Claude-Session: https://claude.ai/code/session_01PJpmsAhu3FYZH44zRn9hav
</commit_message>
<xml_diff>
--- a/lib/brief/brief-sponsoringowy-marki.docx
+++ b/lib/brief/brief-sponsoringowy-marki.docx
@@ -42,7 +42,7 @@
           <w:sz w:val="22"/>
           <w:szCs w:val="22"/>
         </w:rPr>
-        <w:t xml:space="preserve">Dokument, który marka wypełnia u siebie, zanim poprosi klub, akademię, wydarzenie lub zawodnika o ofertę. Dzięki niemu każdy kandydat odpowiada na ten sam problem biznesowy, a nie przysyła cennika pakietów.</w:t>
+        <w:t xml:space="preserve">Dokument, który marka wypełnia u siebie, zanim poprosi klub, akademię, wydarzenie lub zawodnika o ofertę. Dzięki niemu każdy potencjalny partner odpowiada na ten sam problem biznesowy, a nie przysyła cennika pakietów.</w:t>
       </w:r>
     </w:p>
     <w:tbl>
@@ -633,7 +633,7 @@
           <w:sz w:val="20"/>
           <w:szCs w:val="20"/>
         </w:rPr>
-        <w:t xml:space="preserve">Wyślijcie tę samą wersję do kilku kandydatów. </w:t>
+        <w:t xml:space="preserve">Wyślijcie tę samą wersję do kilku potencjalnych partnerów. </w:t>
       </w:r>
       <w:r>
         <w:rPr>
@@ -3289,7 +3289,7 @@
                 <w:sz w:val="19"/>
                 <w:szCs w:val="19"/>
               </w:rPr>
-              <w:t xml:space="preserve">każdy klub i każdy zawodnik ma inną publiczność. Kandydat, który wie, kogo szukacie, pokaże dane o właściwej grupie, a nie łączne zasięgi.</w:t>
+              <w:t xml:space="preserve">każdy klub i każdy zawodnik ma inną publiczność. Partner, który wie, kogo szukacie, pokaże dane o właściwej grupie, a nie łączne zasięgi.</w:t>
             </w:r>
           </w:p>
         </w:tc>
@@ -4108,7 +4108,7 @@
                 <w:sz w:val="19"/>
                 <w:szCs w:val="19"/>
               </w:rPr>
-              <w:t xml:space="preserve">jasne kryteria oszczędzają czas obu stronom. Kandydat, który ich nie spełnia, odpadnie sam, zanim przygotuje propozycję.</w:t>
+              <w:t xml:space="preserve">jasne kryteria oszczędzają czas obu stronom. Potencjalny partner, który ich nie spełnia, odpadnie sam, zanim przygotuje propozycję.</w:t>
             </w:r>
           </w:p>
         </w:tc>
@@ -4798,7 +4798,7 @@
           <w:sz w:val="20"/>
           <w:szCs w:val="20"/>
         </w:rPr>
-        <w:t xml:space="preserve">Czerwone flagi, które wykluczają kandydata</w:t>
+        <w:t xml:space="preserve">Czerwone flagi, które wykluczają partnera</w:t>
       </w:r>
     </w:p>
     <w:tbl>
@@ -4911,7 +4911,7 @@
                 <w:sz w:val="20"/>
                 <w:szCs w:val="20"/>
               </w:rPr>
-              <w:t xml:space="preserve">Poproście kandydatów o wynik Commercial Score</w:t>
+              <w:t xml:space="preserve">Poproście potencjalnych partnerów o wynik Commercial Score</w:t>
             </w:r>
           </w:p>
           <w:p>
@@ -4924,7 +4924,7 @@
                 <w:sz w:val="19"/>
                 <w:szCs w:val="19"/>
               </w:rPr>
-              <w:t xml:space="preserve">To bezpłatna samoocena gotowości komercyjnej klubu, organizacji lub zawodnika w sześciu obszarach: publiczność, aktywa komercyjne, pozycjonowanie i oferta, sprzedaż, aktywacja i pomiar, relacje B2B. Wynik 0–100 pozwala porównać kandydatów tą samą miarą, zanim zobaczycie ich propozycje. Kandydat wykonuje go w kilka minut na sportspacepro.pl/commercial-score.</w:t>
+              <w:t xml:space="preserve">To bezpłatna samoocena gotowości komercyjnej klubu, organizacji lub zawodnika w sześciu obszarach: publiczność, aktywa komercyjne, pozycjonowanie i oferta, sprzedaż, aktywacja i pomiar, relacje B2B. Wynik 0–100 pozwala porównać potencjalnych partnerów tą samą miarą, zanim zobaczycie ich propozycje. Klub lub zawodnik wykonuje go w kilka minut na sportspacepro.pl/commercial-score.</w:t>
             </w:r>
           </w:p>
         </w:tc>
@@ -10063,7 +10063,7 @@
                 <w:sz w:val="19"/>
                 <w:szCs w:val="19"/>
               </w:rPr>
-              <w:t xml:space="preserve">Wysłanie briefu do kandydatów</w:t>
+              <w:t xml:space="preserve">Wysłanie briefu do potencjalnych partnerów</w:t>
             </w:r>
           </w:p>
         </w:tc>
@@ -10149,7 +10149,7 @@
                 <w:sz w:val="19"/>
                 <w:szCs w:val="19"/>
               </w:rPr>
-              <w:t xml:space="preserve">Pytania od kandydatów</w:t>
+              <w:t xml:space="preserve">Pytania od potencjalnych partnerów</w:t>
             </w:r>
           </w:p>
         </w:tc>
@@ -10321,7 +10321,7 @@
                 <w:sz w:val="19"/>
                 <w:szCs w:val="19"/>
               </w:rPr>
-              <w:t xml:space="preserve">Spotkania z wybranymi kandydatami</w:t>
+              <w:t xml:space="preserve">Spotkania z wybranymi partnerami</w:t>
             </w:r>
           </w:p>
         </w:tc>
@@ -10977,7 +10977,7 @@
           <w:sz w:val="19"/>
           <w:szCs w:val="19"/>
         </w:rPr>
-        <w:t xml:space="preserve">Ustalcie wagi, zanim otworzycie pierwszą propozycję; razem mają dać 100%. Każdy obszar oceńcie od 1 do 5. Wynik kandydata to suma (ocena × waga) podzielona przez 5; najwyżej 100 punktów. Cenę porównujcie dopiero po ocenie.</w:t>
+        <w:t xml:space="preserve">Ustalcie wagi, zanim otworzycie pierwszą propozycję; razem mają dać 100%. Każdy obszar oceńcie od 1 do 5. Wynik partnera to suma (ocena × waga) podzielona przez 5; najwyżej 100 punktów. Cenę porównujcie dopiero po ocenie.</w:t>
       </w:r>
     </w:p>
     <w:tbl>
@@ -11104,7 +11104,7 @@
                 <w:sz w:val="18"/>
                 <w:szCs w:val="18"/>
               </w:rPr>
-              <w:t xml:space="preserve">Kandydat A</w:t>
+              <w:t xml:space="preserve">Partner A</w:t>
             </w:r>
           </w:p>
         </w:tc>
@@ -11139,7 +11139,7 @@
                 <w:sz w:val="18"/>
                 <w:szCs w:val="18"/>
               </w:rPr>
-              <w:t xml:space="preserve">Kandydat B</w:t>
+              <w:t xml:space="preserve">Partner B</w:t>
             </w:r>
           </w:p>
         </w:tc>
@@ -11174,7 +11174,7 @@
                 <w:sz w:val="18"/>
                 <w:szCs w:val="18"/>
               </w:rPr>
-              <w:t xml:space="preserve">Kandydat C</w:t>
+              <w:t xml:space="preserve">Partner C</w:t>
             </w:r>
           </w:p>
         </w:tc>

</xml_diff>

<commit_message>
Fix brief download anchor and polish the .docx layout
- 'Pobierz wzór' linked to #[object Object]: the anchor id was imported
  into a server component from a 'use client' module. Moved to lib.
- Header/footer as two-column tables so viewers that ignore right tabs
  no longer run the text together; footer shows the page number only.
- Scorecard always starts its own last page and its table stays whole.

Co-Authored-By: Claude Opus 5.5 <noreply@anthropic.com>
Claude-Session: https://claude.ai/code/session_01PJpmsAhu3FYZH44zRn9hav
</commit_message>
<xml_diff>
--- a/lib/brief/brief-sponsoringowy-marki.docx
+++ b/lib/brief/brief-sponsoringowy-marki.docx
@@ -85,6 +85,8 @@
           </w:tcPr>
           <w:p>
             <w:pPr>
+              <w:keepNext w:val="false"/>
+              <w:keepLines w:val="false"/>
               <w:spacing w:after="0"/>
               <w:jc w:val="left"/>
             </w:pPr>
@@ -120,6 +122,8 @@
           </w:tcPr>
           <w:p>
             <w:pPr>
+              <w:keepNext w:val="false"/>
+              <w:keepLines w:val="false"/>
               <w:spacing w:after="0"/>
               <w:jc w:val="left"/>
             </w:pPr>
@@ -159,6 +163,8 @@
           </w:tcPr>
           <w:p>
             <w:pPr>
+              <w:keepNext w:val="false"/>
+              <w:keepLines w:val="false"/>
               <w:spacing w:after="0"/>
               <w:jc w:val="left"/>
             </w:pPr>
@@ -194,6 +200,8 @@
           </w:tcPr>
           <w:p>
             <w:pPr>
+              <w:keepNext w:val="false"/>
+              <w:keepLines w:val="false"/>
               <w:spacing w:after="0"/>
               <w:jc w:val="left"/>
             </w:pPr>
@@ -245,6 +253,8 @@
           </w:tcPr>
           <w:p>
             <w:pPr>
+              <w:keepNext w:val="false"/>
+              <w:keepLines w:val="false"/>
               <w:spacing w:after="0"/>
               <w:jc w:val="left"/>
             </w:pPr>
@@ -280,6 +290,8 @@
           </w:tcPr>
           <w:p>
             <w:pPr>
+              <w:keepNext w:val="false"/>
+              <w:keepLines w:val="false"/>
               <w:spacing w:after="0"/>
               <w:jc w:val="left"/>
             </w:pPr>
@@ -331,6 +343,8 @@
           </w:tcPr>
           <w:p>
             <w:pPr>
+              <w:keepNext w:val="false"/>
+              <w:keepLines w:val="false"/>
               <w:spacing w:after="0"/>
               <w:jc w:val="left"/>
             </w:pPr>
@@ -366,6 +380,8 @@
           </w:tcPr>
           <w:p>
             <w:pPr>
+              <w:keepNext w:val="false"/>
+              <w:keepLines w:val="false"/>
               <w:spacing w:after="0"/>
               <w:jc w:val="left"/>
             </w:pPr>
@@ -417,6 +433,8 @@
           </w:tcPr>
           <w:p>
             <w:pPr>
+              <w:keepNext w:val="false"/>
+              <w:keepLines w:val="false"/>
               <w:spacing w:after="0"/>
               <w:jc w:val="left"/>
             </w:pPr>
@@ -452,6 +470,8 @@
           </w:tcPr>
           <w:p>
             <w:pPr>
+              <w:keepNext w:val="false"/>
+              <w:keepLines w:val="false"/>
               <w:spacing w:after="0"/>
               <w:jc w:val="left"/>
             </w:pPr>
@@ -503,6 +523,8 @@
           </w:tcPr>
           <w:p>
             <w:pPr>
+              <w:keepNext w:val="false"/>
+              <w:keepLines w:val="false"/>
               <w:spacing w:after="0"/>
               <w:jc w:val="left"/>
             </w:pPr>
@@ -538,6 +560,8 @@
           </w:tcPr>
           <w:p>
             <w:pPr>
+              <w:keepNext w:val="false"/>
+              <w:keepLines w:val="false"/>
               <w:spacing w:after="0"/>
               <w:jc w:val="left"/>
             </w:pPr>
@@ -847,7 +871,7 @@
       </w:tblGrid>
       <w:tr>
         <w:trPr>
-          <w:trHeight w:val="760" w:hRule="atLeast"/>
+          <w:trHeight w:val="620" w:hRule="atLeast"/>
         </w:trPr>
         <w:tc>
           <w:tcPr>
@@ -929,7 +953,7 @@
       </w:tblGrid>
       <w:tr>
         <w:trPr>
-          <w:trHeight w:val="760" w:hRule="atLeast"/>
+          <w:trHeight w:val="620" w:hRule="atLeast"/>
         </w:trPr>
         <w:tc>
           <w:tcPr>
@@ -1011,7 +1035,7 @@
       </w:tblGrid>
       <w:tr>
         <w:trPr>
-          <w:trHeight w:val="760" w:hRule="atLeast"/>
+          <w:trHeight w:val="620" w:hRule="atLeast"/>
         </w:trPr>
         <w:tc>
           <w:tcPr>
@@ -1093,7 +1117,7 @@
       </w:tblGrid>
       <w:tr>
         <w:trPr>
-          <w:trHeight w:val="760" w:hRule="atLeast"/>
+          <w:trHeight w:val="620" w:hRule="atLeast"/>
         </w:trPr>
         <w:tc>
           <w:tcPr>
@@ -1175,7 +1199,7 @@
       </w:tblGrid>
       <w:tr>
         <w:trPr>
-          <w:trHeight w:val="760" w:hRule="atLeast"/>
+          <w:trHeight w:val="620" w:hRule="atLeast"/>
         </w:trPr>
         <w:tc>
           <w:tcPr>
@@ -1370,6 +1394,8 @@
           </w:tcPr>
           <w:p>
             <w:pPr>
+              <w:keepNext w:val="false"/>
+              <w:keepLines w:val="false"/>
               <w:spacing w:after="0"/>
               <w:jc w:val="left"/>
             </w:pPr>
@@ -1405,6 +1431,8 @@
           </w:tcPr>
           <w:p>
             <w:pPr>
+              <w:keepNext w:val="false"/>
+              <w:keepLines w:val="false"/>
               <w:spacing w:after="0"/>
               <w:jc w:val="center"/>
             </w:pPr>
@@ -1440,6 +1468,8 @@
           </w:tcPr>
           <w:p>
             <w:pPr>
+              <w:keepNext w:val="false"/>
+              <w:keepLines w:val="false"/>
               <w:spacing w:after="0"/>
               <w:jc w:val="center"/>
             </w:pPr>
@@ -1479,6 +1509,8 @@
           </w:tcPr>
           <w:p>
             <w:pPr>
+              <w:keepNext w:val="false"/>
+              <w:keepLines w:val="false"/>
               <w:spacing w:after="0"/>
               <w:jc w:val="left"/>
             </w:pPr>
@@ -1513,6 +1545,8 @@
           </w:tcPr>
           <w:p>
             <w:pPr>
+              <w:keepNext w:val="false"/>
+              <w:keepLines w:val="false"/>
               <w:spacing w:after="0"/>
               <w:jc w:val="center"/>
             </w:pPr>
@@ -1557,6 +1591,8 @@
           </w:tcPr>
           <w:p>
             <w:pPr>
+              <w:keepNext w:val="false"/>
+              <w:keepLines w:val="false"/>
               <w:spacing w:after="0"/>
               <w:jc w:val="center"/>
             </w:pPr>
@@ -1606,6 +1642,8 @@
           </w:tcPr>
           <w:p>
             <w:pPr>
+              <w:keepNext w:val="false"/>
+              <w:keepLines w:val="false"/>
               <w:spacing w:after="0"/>
               <w:jc w:val="left"/>
             </w:pPr>
@@ -1640,6 +1678,8 @@
           </w:tcPr>
           <w:p>
             <w:pPr>
+              <w:keepNext w:val="false"/>
+              <w:keepLines w:val="false"/>
               <w:spacing w:after="0"/>
               <w:jc w:val="center"/>
             </w:pPr>
@@ -1684,6 +1724,8 @@
           </w:tcPr>
           <w:p>
             <w:pPr>
+              <w:keepNext w:val="false"/>
+              <w:keepLines w:val="false"/>
               <w:spacing w:after="0"/>
               <w:jc w:val="center"/>
             </w:pPr>
@@ -1733,6 +1775,8 @@
           </w:tcPr>
           <w:p>
             <w:pPr>
+              <w:keepNext w:val="false"/>
+              <w:keepLines w:val="false"/>
               <w:spacing w:after="0"/>
               <w:jc w:val="left"/>
             </w:pPr>
@@ -1767,6 +1811,8 @@
           </w:tcPr>
           <w:p>
             <w:pPr>
+              <w:keepNext w:val="false"/>
+              <w:keepLines w:val="false"/>
               <w:spacing w:after="0"/>
               <w:jc w:val="center"/>
             </w:pPr>
@@ -1811,6 +1857,8 @@
           </w:tcPr>
           <w:p>
             <w:pPr>
+              <w:keepNext w:val="false"/>
+              <w:keepLines w:val="false"/>
               <w:spacing w:after="0"/>
               <w:jc w:val="center"/>
             </w:pPr>
@@ -1860,6 +1908,8 @@
           </w:tcPr>
           <w:p>
             <w:pPr>
+              <w:keepNext w:val="false"/>
+              <w:keepLines w:val="false"/>
               <w:spacing w:after="0"/>
               <w:jc w:val="left"/>
             </w:pPr>
@@ -1894,6 +1944,8 @@
           </w:tcPr>
           <w:p>
             <w:pPr>
+              <w:keepNext w:val="false"/>
+              <w:keepLines w:val="false"/>
               <w:spacing w:after="0"/>
               <w:jc w:val="center"/>
             </w:pPr>
@@ -1938,6 +1990,8 @@
           </w:tcPr>
           <w:p>
             <w:pPr>
+              <w:keepNext w:val="false"/>
+              <w:keepLines w:val="false"/>
               <w:spacing w:after="0"/>
               <w:jc w:val="center"/>
             </w:pPr>
@@ -1987,6 +2041,8 @@
           </w:tcPr>
           <w:p>
             <w:pPr>
+              <w:keepNext w:val="false"/>
+              <w:keepLines w:val="false"/>
               <w:spacing w:after="0"/>
               <w:jc w:val="left"/>
             </w:pPr>
@@ -2021,6 +2077,8 @@
           </w:tcPr>
           <w:p>
             <w:pPr>
+              <w:keepNext w:val="false"/>
+              <w:keepLines w:val="false"/>
               <w:spacing w:after="0"/>
               <w:jc w:val="center"/>
             </w:pPr>
@@ -2065,6 +2123,8 @@
           </w:tcPr>
           <w:p>
             <w:pPr>
+              <w:keepNext w:val="false"/>
+              <w:keepLines w:val="false"/>
               <w:spacing w:after="0"/>
               <w:jc w:val="center"/>
             </w:pPr>
@@ -2114,6 +2174,8 @@
           </w:tcPr>
           <w:p>
             <w:pPr>
+              <w:keepNext w:val="false"/>
+              <w:keepLines w:val="false"/>
               <w:spacing w:after="0"/>
               <w:jc w:val="left"/>
             </w:pPr>
@@ -2148,6 +2210,8 @@
           </w:tcPr>
           <w:p>
             <w:pPr>
+              <w:keepNext w:val="false"/>
+              <w:keepLines w:val="false"/>
               <w:spacing w:after="0"/>
               <w:jc w:val="center"/>
             </w:pPr>
@@ -2192,6 +2256,8 @@
           </w:tcPr>
           <w:p>
             <w:pPr>
+              <w:keepNext w:val="false"/>
+              <w:keepLines w:val="false"/>
               <w:spacing w:after="0"/>
               <w:jc w:val="center"/>
             </w:pPr>
@@ -2282,6 +2348,8 @@
           </w:tcPr>
           <w:p>
             <w:pPr>
+              <w:keepNext w:val="false"/>
+              <w:keepLines w:val="false"/>
               <w:spacing w:after="0"/>
               <w:jc w:val="left"/>
             </w:pPr>
@@ -2317,6 +2385,8 @@
           </w:tcPr>
           <w:p>
             <w:pPr>
+              <w:keepNext w:val="false"/>
+              <w:keepLines w:val="false"/>
               <w:spacing w:after="0"/>
               <w:jc w:val="left"/>
             </w:pPr>
@@ -2352,6 +2422,8 @@
           </w:tcPr>
           <w:p>
             <w:pPr>
+              <w:keepNext w:val="false"/>
+              <w:keepLines w:val="false"/>
               <w:spacing w:after="0"/>
               <w:jc w:val="left"/>
             </w:pPr>
@@ -2387,6 +2459,8 @@
           </w:tcPr>
           <w:p>
             <w:pPr>
+              <w:keepNext w:val="false"/>
+              <w:keepLines w:val="false"/>
               <w:spacing w:after="0"/>
               <w:jc w:val="left"/>
             </w:pPr>
@@ -2426,6 +2500,8 @@
           </w:tcPr>
           <w:p>
             <w:pPr>
+              <w:keepNext w:val="false"/>
+              <w:keepLines w:val="false"/>
               <w:spacing w:after="0"/>
               <w:jc w:val="left"/>
             </w:pPr>
@@ -2460,6 +2536,8 @@
           </w:tcPr>
           <w:p>
             <w:pPr>
+              <w:keepNext w:val="false"/>
+              <w:keepLines w:val="false"/>
               <w:spacing w:after="0"/>
               <w:jc w:val="left"/>
             </w:pPr>
@@ -2494,6 +2572,8 @@
           </w:tcPr>
           <w:p>
             <w:pPr>
+              <w:keepNext w:val="false"/>
+              <w:keepLines w:val="false"/>
               <w:spacing w:after="0"/>
               <w:jc w:val="left"/>
             </w:pPr>
@@ -2528,6 +2608,8 @@
           </w:tcPr>
           <w:p>
             <w:pPr>
+              <w:keepNext w:val="false"/>
+              <w:keepLines w:val="false"/>
               <w:spacing w:after="0"/>
               <w:jc w:val="left"/>
             </w:pPr>
@@ -2568,6 +2650,8 @@
           </w:tcPr>
           <w:p>
             <w:pPr>
+              <w:keepNext w:val="false"/>
+              <w:keepLines w:val="false"/>
               <w:spacing w:after="0"/>
               <w:jc w:val="left"/>
             </w:pPr>
@@ -2615,6 +2699,8 @@
           </w:tcPr>
           <w:p>
             <w:pPr>
+              <w:keepNext w:val="false"/>
+              <w:keepLines w:val="false"/>
               <w:spacing w:after="0"/>
               <w:jc w:val="left"/>
             </w:pPr>
@@ -2662,6 +2748,8 @@
           </w:tcPr>
           <w:p>
             <w:pPr>
+              <w:keepNext w:val="false"/>
+              <w:keepLines w:val="false"/>
               <w:spacing w:after="0"/>
               <w:jc w:val="left"/>
             </w:pPr>
@@ -2709,6 +2797,8 @@
           </w:tcPr>
           <w:p>
             <w:pPr>
+              <w:keepNext w:val="false"/>
+              <w:keepLines w:val="false"/>
               <w:spacing w:after="0"/>
               <w:jc w:val="left"/>
             </w:pPr>
@@ -2761,6 +2851,8 @@
           </w:tcPr>
           <w:p>
             <w:pPr>
+              <w:keepNext w:val="false"/>
+              <w:keepLines w:val="false"/>
               <w:spacing w:after="0"/>
               <w:jc w:val="left"/>
             </w:pPr>
@@ -2808,6 +2900,8 @@
           </w:tcPr>
           <w:p>
             <w:pPr>
+              <w:keepNext w:val="false"/>
+              <w:keepLines w:val="false"/>
               <w:spacing w:after="0"/>
               <w:jc w:val="left"/>
             </w:pPr>
@@ -2855,6 +2949,8 @@
           </w:tcPr>
           <w:p>
             <w:pPr>
+              <w:keepNext w:val="false"/>
+              <w:keepLines w:val="false"/>
               <w:spacing w:after="0"/>
               <w:jc w:val="left"/>
             </w:pPr>
@@ -2902,6 +2998,8 @@
           </w:tcPr>
           <w:p>
             <w:pPr>
+              <w:keepNext w:val="false"/>
+              <w:keepLines w:val="false"/>
               <w:spacing w:after="0"/>
               <w:jc w:val="left"/>
             </w:pPr>
@@ -2954,6 +3052,8 @@
           </w:tcPr>
           <w:p>
             <w:pPr>
+              <w:keepNext w:val="false"/>
+              <w:keepLines w:val="false"/>
               <w:spacing w:after="0"/>
               <w:jc w:val="left"/>
             </w:pPr>
@@ -3001,6 +3101,8 @@
           </w:tcPr>
           <w:p>
             <w:pPr>
+              <w:keepNext w:val="false"/>
+              <w:keepLines w:val="false"/>
               <w:spacing w:after="0"/>
               <w:jc w:val="left"/>
             </w:pPr>
@@ -3048,6 +3150,8 @@
           </w:tcPr>
           <w:p>
             <w:pPr>
+              <w:keepNext w:val="false"/>
+              <w:keepLines w:val="false"/>
               <w:spacing w:after="0"/>
               <w:jc w:val="left"/>
             </w:pPr>
@@ -3095,6 +3199,8 @@
           </w:tcPr>
           <w:p>
             <w:pPr>
+              <w:keepNext w:val="false"/>
+              <w:keepLines w:val="false"/>
               <w:spacing w:after="0"/>
               <w:jc w:val="left"/>
             </w:pPr>
@@ -3157,7 +3263,7 @@
       </w:tblGrid>
       <w:tr>
         <w:trPr>
-          <w:trHeight w:val="760" w:hRule="atLeast"/>
+          <w:trHeight w:val="620" w:hRule="atLeast"/>
         </w:trPr>
         <w:tc>
           <w:tcPr>
@@ -3328,7 +3434,7 @@
       </w:tblGrid>
       <w:tr>
         <w:trPr>
-          <w:trHeight w:val="760" w:hRule="atLeast"/>
+          <w:trHeight w:val="620" w:hRule="atLeast"/>
         </w:trPr>
         <w:tc>
           <w:tcPr>
@@ -3410,7 +3516,7 @@
       </w:tblGrid>
       <w:tr>
         <w:trPr>
-          <w:trHeight w:val="760" w:hRule="atLeast"/>
+          <w:trHeight w:val="620" w:hRule="atLeast"/>
         </w:trPr>
         <w:tc>
           <w:tcPr>
@@ -3636,6 +3742,8 @@
           </w:tcPr>
           <w:p>
             <w:pPr>
+              <w:keepNext w:val="false"/>
+              <w:keepLines w:val="false"/>
               <w:spacing w:after="0"/>
               <w:jc w:val="left"/>
             </w:pPr>
@@ -3671,6 +3779,8 @@
           </w:tcPr>
           <w:p>
             <w:pPr>
+              <w:keepNext w:val="false"/>
+              <w:keepLines w:val="false"/>
               <w:spacing w:after="0"/>
               <w:jc w:val="left"/>
             </w:pPr>
@@ -3711,6 +3821,8 @@
           </w:tcPr>
           <w:p>
             <w:pPr>
+              <w:keepNext w:val="false"/>
+              <w:keepLines w:val="false"/>
               <w:spacing w:after="0"/>
               <w:jc w:val="left"/>
             </w:pPr>
@@ -3758,6 +3870,8 @@
           </w:tcPr>
           <w:p>
             <w:pPr>
+              <w:keepNext w:val="false"/>
+              <w:keepLines w:val="false"/>
               <w:spacing w:after="0"/>
               <w:jc w:val="left"/>
             </w:pPr>
@@ -3976,7 +4090,7 @@
       </w:tblGrid>
       <w:tr>
         <w:trPr>
-          <w:trHeight w:val="460" w:hRule="atLeast"/>
+          <w:trHeight w:val="360" w:hRule="atLeast"/>
         </w:trPr>
         <w:tc>
           <w:tcPr>
@@ -4552,6 +4666,8 @@
           </w:tcPr>
           <w:p>
             <w:pPr>
+              <w:keepNext w:val="false"/>
+              <w:keepLines w:val="false"/>
               <w:spacing w:after="0"/>
               <w:jc w:val="left"/>
             </w:pPr>
@@ -4587,6 +4703,8 @@
           </w:tcPr>
           <w:p>
             <w:pPr>
+              <w:keepNext w:val="false"/>
+              <w:keepLines w:val="false"/>
               <w:spacing w:after="0"/>
               <w:jc w:val="left"/>
             </w:pPr>
@@ -4627,6 +4745,8 @@
           </w:tcPr>
           <w:p>
             <w:pPr>
+              <w:keepNext w:val="false"/>
+              <w:keepLines w:val="false"/>
               <w:spacing w:after="0"/>
               <w:jc w:val="left"/>
             </w:pPr>
@@ -4674,6 +4794,8 @@
           </w:tcPr>
           <w:p>
             <w:pPr>
+              <w:keepNext w:val="false"/>
+              <w:keepLines w:val="false"/>
               <w:spacing w:after="0"/>
               <w:jc w:val="left"/>
             </w:pPr>
@@ -4736,7 +4858,7 @@
       </w:tblGrid>
       <w:tr>
         <w:trPr>
-          <w:trHeight w:val="760" w:hRule="atLeast"/>
+          <w:trHeight w:val="620" w:hRule="atLeast"/>
         </w:trPr>
         <w:tc>
           <w:tcPr>
@@ -4818,7 +4940,7 @@
       </w:tblGrid>
       <w:tr>
         <w:trPr>
-          <w:trHeight w:val="760" w:hRule="atLeast"/>
+          <w:trHeight w:val="620" w:hRule="atLeast"/>
         </w:trPr>
         <w:tc>
           <w:tcPr>
@@ -5076,6 +5198,8 @@
           </w:tcPr>
           <w:p>
             <w:pPr>
+              <w:keepNext w:val="false"/>
+              <w:keepLines w:val="false"/>
               <w:spacing w:after="0"/>
               <w:jc w:val="left"/>
             </w:pPr>
@@ -5111,6 +5235,8 @@
           </w:tcPr>
           <w:p>
             <w:pPr>
+              <w:keepNext w:val="false"/>
+              <w:keepLines w:val="false"/>
               <w:spacing w:after="0"/>
               <w:jc w:val="left"/>
             </w:pPr>
@@ -5146,6 +5272,8 @@
           </w:tcPr>
           <w:p>
             <w:pPr>
+              <w:keepNext w:val="false"/>
+              <w:keepLines w:val="false"/>
               <w:spacing w:after="0"/>
               <w:jc w:val="left"/>
             </w:pPr>
@@ -5185,6 +5313,8 @@
           </w:tcPr>
           <w:p>
             <w:pPr>
+              <w:keepNext w:val="false"/>
+              <w:keepLines w:val="false"/>
               <w:spacing w:after="0"/>
               <w:jc w:val="left"/>
             </w:pPr>
@@ -5220,6 +5350,8 @@
           </w:tcPr>
           <w:p>
             <w:pPr>
+              <w:keepNext w:val="false"/>
+              <w:keepLines w:val="false"/>
               <w:spacing w:after="0"/>
               <w:jc w:val="left"/>
             </w:pPr>
@@ -5267,6 +5399,8 @@
           </w:tcPr>
           <w:p>
             <w:pPr>
+              <w:keepNext w:val="false"/>
+              <w:keepLines w:val="false"/>
               <w:spacing w:after="0"/>
               <w:jc w:val="left"/>
             </w:pPr>
@@ -5318,6 +5452,8 @@
           </w:tcPr>
           <w:p>
             <w:pPr>
+              <w:keepNext w:val="false"/>
+              <w:keepLines w:val="false"/>
               <w:spacing w:after="0"/>
               <w:jc w:val="left"/>
             </w:pPr>
@@ -5353,6 +5489,8 @@
           </w:tcPr>
           <w:p>
             <w:pPr>
+              <w:keepNext w:val="false"/>
+              <w:keepLines w:val="false"/>
               <w:spacing w:after="0"/>
               <w:jc w:val="left"/>
             </w:pPr>
@@ -5400,6 +5538,8 @@
           </w:tcPr>
           <w:p>
             <w:pPr>
+              <w:keepNext w:val="false"/>
+              <w:keepLines w:val="false"/>
               <w:spacing w:after="0"/>
               <w:jc w:val="left"/>
             </w:pPr>
@@ -5451,6 +5591,8 @@
           </w:tcPr>
           <w:p>
             <w:pPr>
+              <w:keepNext w:val="false"/>
+              <w:keepLines w:val="false"/>
               <w:spacing w:after="0"/>
               <w:jc w:val="left"/>
             </w:pPr>
@@ -5486,6 +5628,8 @@
           </w:tcPr>
           <w:p>
             <w:pPr>
+              <w:keepNext w:val="false"/>
+              <w:keepLines w:val="false"/>
               <w:spacing w:after="0"/>
               <w:jc w:val="left"/>
             </w:pPr>
@@ -5533,6 +5677,8 @@
           </w:tcPr>
           <w:p>
             <w:pPr>
+              <w:keepNext w:val="false"/>
+              <w:keepLines w:val="false"/>
               <w:spacing w:after="0"/>
               <w:jc w:val="left"/>
             </w:pPr>
@@ -5741,7 +5887,7 @@
       </w:tblGrid>
       <w:tr>
         <w:trPr>
-          <w:trHeight w:val="460" w:hRule="atLeast"/>
+          <w:trHeight w:val="360" w:hRule="atLeast"/>
         </w:trPr>
         <w:tc>
           <w:tcPr>
@@ -5847,6 +5993,8 @@
           </w:tcPr>
           <w:p>
             <w:pPr>
+              <w:keepNext w:val="false"/>
+              <w:keepLines w:val="false"/>
               <w:spacing w:after="0"/>
               <w:jc w:val="center"/>
             </w:pPr>
@@ -5882,6 +6030,8 @@
           </w:tcPr>
           <w:p>
             <w:pPr>
+              <w:keepNext w:val="false"/>
+              <w:keepLines w:val="false"/>
               <w:spacing w:after="0"/>
               <w:jc w:val="left"/>
             </w:pPr>
@@ -5917,6 +6067,8 @@
           </w:tcPr>
           <w:p>
             <w:pPr>
+              <w:keepNext w:val="false"/>
+              <w:keepLines w:val="false"/>
               <w:spacing w:after="0"/>
               <w:jc w:val="left"/>
             </w:pPr>
@@ -5956,6 +6108,8 @@
           </w:tcPr>
           <w:p>
             <w:pPr>
+              <w:keepNext w:val="false"/>
+              <w:keepLines w:val="false"/>
               <w:spacing w:after="0"/>
               <w:jc w:val="center"/>
             </w:pPr>
@@ -6000,6 +6154,8 @@
           </w:tcPr>
           <w:p>
             <w:pPr>
+              <w:keepNext w:val="false"/>
+              <w:keepLines w:val="false"/>
               <w:spacing w:after="0"/>
               <w:jc w:val="left"/>
             </w:pPr>
@@ -6035,6 +6191,8 @@
           </w:tcPr>
           <w:p>
             <w:pPr>
+              <w:keepNext w:val="false"/>
+              <w:keepLines w:val="false"/>
               <w:spacing w:after="0"/>
               <w:jc w:val="left"/>
             </w:pPr>
@@ -6086,6 +6244,8 @@
           </w:tcPr>
           <w:p>
             <w:pPr>
+              <w:keepNext w:val="false"/>
+              <w:keepLines w:val="false"/>
               <w:spacing w:after="0"/>
               <w:jc w:val="center"/>
             </w:pPr>
@@ -6130,6 +6290,8 @@
           </w:tcPr>
           <w:p>
             <w:pPr>
+              <w:keepNext w:val="false"/>
+              <w:keepLines w:val="false"/>
               <w:spacing w:after="0"/>
               <w:jc w:val="left"/>
             </w:pPr>
@@ -6165,6 +6327,8 @@
           </w:tcPr>
           <w:p>
             <w:pPr>
+              <w:keepNext w:val="false"/>
+              <w:keepLines w:val="false"/>
               <w:spacing w:after="0"/>
               <w:jc w:val="left"/>
             </w:pPr>
@@ -6216,6 +6380,8 @@
           </w:tcPr>
           <w:p>
             <w:pPr>
+              <w:keepNext w:val="false"/>
+              <w:keepLines w:val="false"/>
               <w:spacing w:after="0"/>
               <w:jc w:val="center"/>
             </w:pPr>
@@ -6260,6 +6426,8 @@
           </w:tcPr>
           <w:p>
             <w:pPr>
+              <w:keepNext w:val="false"/>
+              <w:keepLines w:val="false"/>
               <w:spacing w:after="0"/>
               <w:jc w:val="left"/>
             </w:pPr>
@@ -6295,6 +6463,8 @@
           </w:tcPr>
           <w:p>
             <w:pPr>
+              <w:keepNext w:val="false"/>
+              <w:keepLines w:val="false"/>
               <w:spacing w:after="0"/>
               <w:jc w:val="left"/>
             </w:pPr>
@@ -6346,6 +6516,8 @@
           </w:tcPr>
           <w:p>
             <w:pPr>
+              <w:keepNext w:val="false"/>
+              <w:keepLines w:val="false"/>
               <w:spacing w:after="0"/>
               <w:jc w:val="center"/>
             </w:pPr>
@@ -6390,6 +6562,8 @@
           </w:tcPr>
           <w:p>
             <w:pPr>
+              <w:keepNext w:val="false"/>
+              <w:keepLines w:val="false"/>
               <w:spacing w:after="0"/>
               <w:jc w:val="left"/>
             </w:pPr>
@@ -6425,6 +6599,8 @@
           </w:tcPr>
           <w:p>
             <w:pPr>
+              <w:keepNext w:val="false"/>
+              <w:keepLines w:val="false"/>
               <w:spacing w:after="0"/>
               <w:jc w:val="left"/>
             </w:pPr>
@@ -6476,6 +6652,8 @@
           </w:tcPr>
           <w:p>
             <w:pPr>
+              <w:keepNext w:val="false"/>
+              <w:keepLines w:val="false"/>
               <w:spacing w:after="0"/>
               <w:jc w:val="center"/>
             </w:pPr>
@@ -6520,6 +6698,8 @@
           </w:tcPr>
           <w:p>
             <w:pPr>
+              <w:keepNext w:val="false"/>
+              <w:keepLines w:val="false"/>
               <w:spacing w:after="0"/>
               <w:jc w:val="left"/>
             </w:pPr>
@@ -6555,6 +6735,8 @@
           </w:tcPr>
           <w:p>
             <w:pPr>
+              <w:keepNext w:val="false"/>
+              <w:keepLines w:val="false"/>
               <w:spacing w:after="0"/>
               <w:jc w:val="left"/>
             </w:pPr>
@@ -6606,6 +6788,8 @@
           </w:tcPr>
           <w:p>
             <w:pPr>
+              <w:keepNext w:val="false"/>
+              <w:keepLines w:val="false"/>
               <w:spacing w:after="0"/>
               <w:jc w:val="center"/>
             </w:pPr>
@@ -6650,6 +6834,8 @@
           </w:tcPr>
           <w:p>
             <w:pPr>
+              <w:keepNext w:val="false"/>
+              <w:keepLines w:val="false"/>
               <w:spacing w:after="0"/>
               <w:jc w:val="left"/>
             </w:pPr>
@@ -6685,6 +6871,8 @@
           </w:tcPr>
           <w:p>
             <w:pPr>
+              <w:keepNext w:val="false"/>
+              <w:keepLines w:val="false"/>
               <w:spacing w:after="0"/>
               <w:jc w:val="left"/>
             </w:pPr>
@@ -6736,6 +6924,8 @@
           </w:tcPr>
           <w:p>
             <w:pPr>
+              <w:keepNext w:val="false"/>
+              <w:keepLines w:val="false"/>
               <w:spacing w:after="0"/>
               <w:jc w:val="center"/>
             </w:pPr>
@@ -6780,6 +6970,8 @@
           </w:tcPr>
           <w:p>
             <w:pPr>
+              <w:keepNext w:val="false"/>
+              <w:keepLines w:val="false"/>
               <w:spacing w:after="0"/>
               <w:jc w:val="left"/>
             </w:pPr>
@@ -6815,6 +7007,8 @@
           </w:tcPr>
           <w:p>
             <w:pPr>
+              <w:keepNext w:val="false"/>
+              <w:keepLines w:val="false"/>
               <w:spacing w:after="0"/>
               <w:jc w:val="left"/>
             </w:pPr>
@@ -6866,6 +7060,8 @@
           </w:tcPr>
           <w:p>
             <w:pPr>
+              <w:keepNext w:val="false"/>
+              <w:keepLines w:val="false"/>
               <w:spacing w:after="0"/>
               <w:jc w:val="center"/>
             </w:pPr>
@@ -6910,6 +7106,8 @@
           </w:tcPr>
           <w:p>
             <w:pPr>
+              <w:keepNext w:val="false"/>
+              <w:keepLines w:val="false"/>
               <w:spacing w:after="0"/>
               <w:jc w:val="left"/>
             </w:pPr>
@@ -6945,6 +7143,8 @@
           </w:tcPr>
           <w:p>
             <w:pPr>
+              <w:keepNext w:val="false"/>
+              <w:keepLines w:val="false"/>
               <w:spacing w:after="0"/>
               <w:jc w:val="left"/>
             </w:pPr>
@@ -7007,7 +7207,7 @@
       </w:tblGrid>
       <w:tr>
         <w:trPr>
-          <w:trHeight w:val="760" w:hRule="atLeast"/>
+          <w:trHeight w:val="620" w:hRule="atLeast"/>
         </w:trPr>
         <w:tc>
           <w:tcPr>
@@ -7192,6 +7392,8 @@
           </w:tcPr>
           <w:p>
             <w:pPr>
+              <w:keepNext w:val="false"/>
+              <w:keepLines w:val="false"/>
               <w:spacing w:after="0"/>
               <w:jc w:val="left"/>
             </w:pPr>
@@ -7227,6 +7429,8 @@
           </w:tcPr>
           <w:p>
             <w:pPr>
+              <w:keepNext w:val="false"/>
+              <w:keepLines w:val="false"/>
               <w:spacing w:after="0"/>
               <w:jc w:val="center"/>
             </w:pPr>
@@ -7262,6 +7466,8 @@
           </w:tcPr>
           <w:p>
             <w:pPr>
+              <w:keepNext w:val="false"/>
+              <w:keepLines w:val="false"/>
               <w:spacing w:after="0"/>
               <w:jc w:val="center"/>
             </w:pPr>
@@ -7297,6 +7503,8 @@
           </w:tcPr>
           <w:p>
             <w:pPr>
+              <w:keepNext w:val="false"/>
+              <w:keepLines w:val="false"/>
               <w:spacing w:after="0"/>
               <w:jc w:val="center"/>
             </w:pPr>
@@ -7336,6 +7544,8 @@
           </w:tcPr>
           <w:p>
             <w:pPr>
+              <w:keepNext w:val="false"/>
+              <w:keepLines w:val="false"/>
               <w:spacing w:after="0"/>
               <w:jc w:val="left"/>
             </w:pPr>
@@ -7370,6 +7580,8 @@
           </w:tcPr>
           <w:p>
             <w:pPr>
+              <w:keepNext w:val="false"/>
+              <w:keepLines w:val="false"/>
               <w:spacing w:after="0"/>
               <w:jc w:val="center"/>
             </w:pPr>
@@ -7414,6 +7626,8 @@
           </w:tcPr>
           <w:p>
             <w:pPr>
+              <w:keepNext w:val="false"/>
+              <w:keepLines w:val="false"/>
               <w:spacing w:after="0"/>
               <w:jc w:val="center"/>
             </w:pPr>
@@ -7458,6 +7672,8 @@
           </w:tcPr>
           <w:p>
             <w:pPr>
+              <w:keepNext w:val="false"/>
+              <w:keepLines w:val="false"/>
               <w:spacing w:after="0"/>
               <w:jc w:val="center"/>
             </w:pPr>
@@ -7507,6 +7723,8 @@
           </w:tcPr>
           <w:p>
             <w:pPr>
+              <w:keepNext w:val="false"/>
+              <w:keepLines w:val="false"/>
               <w:spacing w:after="0"/>
               <w:jc w:val="left"/>
             </w:pPr>
@@ -7541,6 +7759,8 @@
           </w:tcPr>
           <w:p>
             <w:pPr>
+              <w:keepNext w:val="false"/>
+              <w:keepLines w:val="false"/>
               <w:spacing w:after="0"/>
               <w:jc w:val="center"/>
             </w:pPr>
@@ -7585,6 +7805,8 @@
           </w:tcPr>
           <w:p>
             <w:pPr>
+              <w:keepNext w:val="false"/>
+              <w:keepLines w:val="false"/>
               <w:spacing w:after="0"/>
               <w:jc w:val="center"/>
             </w:pPr>
@@ -7629,6 +7851,8 @@
           </w:tcPr>
           <w:p>
             <w:pPr>
+              <w:keepNext w:val="false"/>
+              <w:keepLines w:val="false"/>
               <w:spacing w:after="0"/>
               <w:jc w:val="center"/>
             </w:pPr>
@@ -7678,6 +7902,8 @@
           </w:tcPr>
           <w:p>
             <w:pPr>
+              <w:keepNext w:val="false"/>
+              <w:keepLines w:val="false"/>
               <w:spacing w:after="0"/>
               <w:jc w:val="left"/>
             </w:pPr>
@@ -7712,6 +7938,8 @@
           </w:tcPr>
           <w:p>
             <w:pPr>
+              <w:keepNext w:val="false"/>
+              <w:keepLines w:val="false"/>
               <w:spacing w:after="0"/>
               <w:jc w:val="center"/>
             </w:pPr>
@@ -7756,6 +7984,8 @@
           </w:tcPr>
           <w:p>
             <w:pPr>
+              <w:keepNext w:val="false"/>
+              <w:keepLines w:val="false"/>
               <w:spacing w:after="0"/>
               <w:jc w:val="center"/>
             </w:pPr>
@@ -7800,6 +8030,8 @@
           </w:tcPr>
           <w:p>
             <w:pPr>
+              <w:keepNext w:val="false"/>
+              <w:keepLines w:val="false"/>
               <w:spacing w:after="0"/>
               <w:jc w:val="center"/>
             </w:pPr>
@@ -7849,6 +8081,8 @@
           </w:tcPr>
           <w:p>
             <w:pPr>
+              <w:keepNext w:val="false"/>
+              <w:keepLines w:val="false"/>
               <w:spacing w:after="0"/>
               <w:jc w:val="left"/>
             </w:pPr>
@@ -7883,6 +8117,8 @@
           </w:tcPr>
           <w:p>
             <w:pPr>
+              <w:keepNext w:val="false"/>
+              <w:keepLines w:val="false"/>
               <w:spacing w:after="0"/>
               <w:jc w:val="center"/>
             </w:pPr>
@@ -7927,6 +8163,8 @@
           </w:tcPr>
           <w:p>
             <w:pPr>
+              <w:keepNext w:val="false"/>
+              <w:keepLines w:val="false"/>
               <w:spacing w:after="0"/>
               <w:jc w:val="center"/>
             </w:pPr>
@@ -7971,6 +8209,8 @@
           </w:tcPr>
           <w:p>
             <w:pPr>
+              <w:keepNext w:val="false"/>
+              <w:keepLines w:val="false"/>
               <w:spacing w:after="0"/>
               <w:jc w:val="center"/>
             </w:pPr>
@@ -8020,6 +8260,8 @@
           </w:tcPr>
           <w:p>
             <w:pPr>
+              <w:keepNext w:val="false"/>
+              <w:keepLines w:val="false"/>
               <w:spacing w:after="0"/>
               <w:jc w:val="left"/>
             </w:pPr>
@@ -8054,6 +8296,8 @@
           </w:tcPr>
           <w:p>
             <w:pPr>
+              <w:keepNext w:val="false"/>
+              <w:keepLines w:val="false"/>
               <w:spacing w:after="0"/>
               <w:jc w:val="center"/>
             </w:pPr>
@@ -8098,6 +8342,8 @@
           </w:tcPr>
           <w:p>
             <w:pPr>
+              <w:keepNext w:val="false"/>
+              <w:keepLines w:val="false"/>
               <w:spacing w:after="0"/>
               <w:jc w:val="center"/>
             </w:pPr>
@@ -8142,6 +8388,8 @@
           </w:tcPr>
           <w:p>
             <w:pPr>
+              <w:keepNext w:val="false"/>
+              <w:keepLines w:val="false"/>
               <w:spacing w:after="0"/>
               <w:jc w:val="center"/>
             </w:pPr>
@@ -8191,6 +8439,8 @@
           </w:tcPr>
           <w:p>
             <w:pPr>
+              <w:keepNext w:val="false"/>
+              <w:keepLines w:val="false"/>
               <w:spacing w:after="0"/>
               <w:jc w:val="left"/>
             </w:pPr>
@@ -8225,6 +8475,8 @@
           </w:tcPr>
           <w:p>
             <w:pPr>
+              <w:keepNext w:val="false"/>
+              <w:keepLines w:val="false"/>
               <w:spacing w:after="0"/>
               <w:jc w:val="center"/>
             </w:pPr>
@@ -8269,6 +8521,8 @@
           </w:tcPr>
           <w:p>
             <w:pPr>
+              <w:keepNext w:val="false"/>
+              <w:keepLines w:val="false"/>
               <w:spacing w:after="0"/>
               <w:jc w:val="center"/>
             </w:pPr>
@@ -8313,6 +8567,8 @@
           </w:tcPr>
           <w:p>
             <w:pPr>
+              <w:keepNext w:val="false"/>
+              <w:keepLines w:val="false"/>
               <w:spacing w:after="0"/>
               <w:jc w:val="center"/>
             </w:pPr>
@@ -8362,6 +8618,8 @@
           </w:tcPr>
           <w:p>
             <w:pPr>
+              <w:keepNext w:val="false"/>
+              <w:keepLines w:val="false"/>
               <w:spacing w:after="0"/>
               <w:jc w:val="left"/>
             </w:pPr>
@@ -8396,6 +8654,8 @@
           </w:tcPr>
           <w:p>
             <w:pPr>
+              <w:keepNext w:val="false"/>
+              <w:keepLines w:val="false"/>
               <w:spacing w:after="0"/>
               <w:jc w:val="center"/>
             </w:pPr>
@@ -8440,6 +8700,8 @@
           </w:tcPr>
           <w:p>
             <w:pPr>
+              <w:keepNext w:val="false"/>
+              <w:keepLines w:val="false"/>
               <w:spacing w:after="0"/>
               <w:jc w:val="center"/>
             </w:pPr>
@@ -8484,6 +8746,8 @@
           </w:tcPr>
           <w:p>
             <w:pPr>
+              <w:keepNext w:val="false"/>
+              <w:keepLines w:val="false"/>
               <w:spacing w:after="0"/>
               <w:jc w:val="center"/>
             </w:pPr>
@@ -8533,6 +8797,8 @@
           </w:tcPr>
           <w:p>
             <w:pPr>
+              <w:keepNext w:val="false"/>
+              <w:keepLines w:val="false"/>
               <w:spacing w:after="0"/>
               <w:jc w:val="left"/>
             </w:pPr>
@@ -8567,6 +8833,8 @@
           </w:tcPr>
           <w:p>
             <w:pPr>
+              <w:keepNext w:val="false"/>
+              <w:keepLines w:val="false"/>
               <w:spacing w:after="0"/>
               <w:jc w:val="center"/>
             </w:pPr>
@@ -8611,6 +8879,8 @@
           </w:tcPr>
           <w:p>
             <w:pPr>
+              <w:keepNext w:val="false"/>
+              <w:keepLines w:val="false"/>
               <w:spacing w:after="0"/>
               <w:jc w:val="center"/>
             </w:pPr>
@@ -8655,6 +8925,8 @@
           </w:tcPr>
           <w:p>
             <w:pPr>
+              <w:keepNext w:val="false"/>
+              <w:keepLines w:val="false"/>
               <w:spacing w:after="0"/>
               <w:jc w:val="center"/>
             </w:pPr>
@@ -8704,6 +8976,8 @@
           </w:tcPr>
           <w:p>
             <w:pPr>
+              <w:keepNext w:val="false"/>
+              <w:keepLines w:val="false"/>
               <w:spacing w:after="0"/>
               <w:jc w:val="left"/>
             </w:pPr>
@@ -8738,6 +9012,8 @@
           </w:tcPr>
           <w:p>
             <w:pPr>
+              <w:keepNext w:val="false"/>
+              <w:keepLines w:val="false"/>
               <w:spacing w:after="0"/>
               <w:jc w:val="center"/>
             </w:pPr>
@@ -8782,6 +9058,8 @@
           </w:tcPr>
           <w:p>
             <w:pPr>
+              <w:keepNext w:val="false"/>
+              <w:keepLines w:val="false"/>
               <w:spacing w:after="0"/>
               <w:jc w:val="center"/>
             </w:pPr>
@@ -8826,6 +9104,8 @@
           </w:tcPr>
           <w:p>
             <w:pPr>
+              <w:keepNext w:val="false"/>
+              <w:keepLines w:val="false"/>
               <w:spacing w:after="0"/>
               <w:jc w:val="center"/>
             </w:pPr>
@@ -8886,7 +9166,7 @@
       </w:tblGrid>
       <w:tr>
         <w:trPr>
-          <w:trHeight w:val="760" w:hRule="atLeast"/>
+          <w:trHeight w:val="620" w:hRule="atLeast"/>
         </w:trPr>
         <w:tc>
           <w:tcPr>
@@ -8968,7 +9248,7 @@
       </w:tblGrid>
       <w:tr>
         <w:trPr>
-          <w:trHeight w:val="760" w:hRule="atLeast"/>
+          <w:trHeight w:val="620" w:hRule="atLeast"/>
         </w:trPr>
         <w:tc>
           <w:tcPr>
@@ -9171,7 +9451,7 @@
       </w:tblGrid>
       <w:tr>
         <w:trPr>
-          <w:trHeight w:val="760" w:hRule="atLeast"/>
+          <w:trHeight w:val="620" w:hRule="atLeast"/>
         </w:trPr>
         <w:tc>
           <w:tcPr>
@@ -9342,7 +9622,7 @@
       </w:tblGrid>
       <w:tr>
         <w:trPr>
-          <w:trHeight w:val="760" w:hRule="atLeast"/>
+          <w:trHeight w:val="620" w:hRule="atLeast"/>
         </w:trPr>
         <w:tc>
           <w:tcPr>
@@ -9424,7 +9704,7 @@
       </w:tblGrid>
       <w:tr>
         <w:trPr>
-          <w:trHeight w:val="760" w:hRule="atLeast"/>
+          <w:trHeight w:val="620" w:hRule="atLeast"/>
         </w:trPr>
         <w:tc>
           <w:tcPr>
@@ -9529,6 +9809,8 @@
           </w:tcPr>
           <w:p>
             <w:pPr>
+              <w:keepNext w:val="false"/>
+              <w:keepLines w:val="false"/>
               <w:spacing w:after="0"/>
               <w:jc w:val="left"/>
             </w:pPr>
@@ -9564,6 +9846,8 @@
           </w:tcPr>
           <w:p>
             <w:pPr>
+              <w:keepNext w:val="false"/>
+              <w:keepLines w:val="false"/>
               <w:spacing w:after="0"/>
               <w:jc w:val="left"/>
             </w:pPr>
@@ -9604,6 +9888,8 @@
           </w:tcPr>
           <w:p>
             <w:pPr>
+              <w:keepNext w:val="false"/>
+              <w:keepLines w:val="false"/>
               <w:spacing w:after="0"/>
               <w:jc w:val="left"/>
             </w:pPr>
@@ -9651,6 +9937,8 @@
           </w:tcPr>
           <w:p>
             <w:pPr>
+              <w:keepNext w:val="false"/>
+              <w:keepLines w:val="false"/>
               <w:spacing w:after="0"/>
               <w:jc w:val="left"/>
             </w:pPr>
@@ -9713,7 +10001,7 @@
       </w:tblGrid>
       <w:tr>
         <w:trPr>
-          <w:trHeight w:val="760" w:hRule="atLeast"/>
+          <w:trHeight w:val="620" w:hRule="atLeast"/>
         </w:trPr>
         <w:tc>
           <w:tcPr>
@@ -9795,7 +10083,7 @@
       </w:tblGrid>
       <w:tr>
         <w:trPr>
-          <w:trHeight w:val="760" w:hRule="atLeast"/>
+          <w:trHeight w:val="620" w:hRule="atLeast"/>
         </w:trPr>
         <w:tc>
           <w:tcPr>
@@ -9978,6 +10266,8 @@
           </w:tcPr>
           <w:p>
             <w:pPr>
+              <w:keepNext w:val="false"/>
+              <w:keepLines w:val="false"/>
               <w:spacing w:after="0"/>
               <w:jc w:val="left"/>
             </w:pPr>
@@ -10013,6 +10303,8 @@
           </w:tcPr>
           <w:p>
             <w:pPr>
+              <w:keepNext w:val="false"/>
+              <w:keepLines w:val="false"/>
               <w:spacing w:after="0"/>
               <w:jc w:val="left"/>
             </w:pPr>
@@ -10052,6 +10344,8 @@
           </w:tcPr>
           <w:p>
             <w:pPr>
+              <w:keepNext w:val="false"/>
+              <w:keepLines w:val="false"/>
               <w:spacing w:after="0"/>
               <w:jc w:val="left"/>
             </w:pPr>
@@ -10087,6 +10381,8 @@
           </w:tcPr>
           <w:p>
             <w:pPr>
+              <w:keepNext w:val="false"/>
+              <w:keepLines w:val="false"/>
               <w:spacing w:after="0"/>
               <w:jc w:val="left"/>
             </w:pPr>
@@ -10138,6 +10434,8 @@
           </w:tcPr>
           <w:p>
             <w:pPr>
+              <w:keepNext w:val="false"/>
+              <w:keepLines w:val="false"/>
               <w:spacing w:after="0"/>
               <w:jc w:val="left"/>
             </w:pPr>
@@ -10173,6 +10471,8 @@
           </w:tcPr>
           <w:p>
             <w:pPr>
+              <w:keepNext w:val="false"/>
+              <w:keepLines w:val="false"/>
               <w:spacing w:after="0"/>
               <w:jc w:val="left"/>
             </w:pPr>
@@ -10224,6 +10524,8 @@
           </w:tcPr>
           <w:p>
             <w:pPr>
+              <w:keepNext w:val="false"/>
+              <w:keepLines w:val="false"/>
               <w:spacing w:after="0"/>
               <w:jc w:val="left"/>
             </w:pPr>
@@ -10259,6 +10561,8 @@
           </w:tcPr>
           <w:p>
             <w:pPr>
+              <w:keepNext w:val="false"/>
+              <w:keepLines w:val="false"/>
               <w:spacing w:after="0"/>
               <w:jc w:val="left"/>
             </w:pPr>
@@ -10310,6 +10614,8 @@
           </w:tcPr>
           <w:p>
             <w:pPr>
+              <w:keepNext w:val="false"/>
+              <w:keepLines w:val="false"/>
               <w:spacing w:after="0"/>
               <w:jc w:val="left"/>
             </w:pPr>
@@ -10345,6 +10651,8 @@
           </w:tcPr>
           <w:p>
             <w:pPr>
+              <w:keepNext w:val="false"/>
+              <w:keepLines w:val="false"/>
               <w:spacing w:after="0"/>
               <w:jc w:val="left"/>
             </w:pPr>
@@ -10396,6 +10704,8 @@
           </w:tcPr>
           <w:p>
             <w:pPr>
+              <w:keepNext w:val="false"/>
+              <w:keepLines w:val="false"/>
               <w:spacing w:after="0"/>
               <w:jc w:val="left"/>
             </w:pPr>
@@ -10431,6 +10741,8 @@
           </w:tcPr>
           <w:p>
             <w:pPr>
+              <w:keepNext w:val="false"/>
+              <w:keepLines w:val="false"/>
               <w:spacing w:after="0"/>
               <w:jc w:val="left"/>
             </w:pPr>
@@ -10482,6 +10794,8 @@
           </w:tcPr>
           <w:p>
             <w:pPr>
+              <w:keepNext w:val="false"/>
+              <w:keepLines w:val="false"/>
               <w:spacing w:after="0"/>
               <w:jc w:val="left"/>
             </w:pPr>
@@ -10517,6 +10831,8 @@
           </w:tcPr>
           <w:p>
             <w:pPr>
+              <w:keepNext w:val="false"/>
+              <w:keepLines w:val="false"/>
               <w:spacing w:after="0"/>
               <w:jc w:val="left"/>
             </w:pPr>
@@ -10579,7 +10895,7 @@
       </w:tblGrid>
       <w:tr>
         <w:trPr>
-          <w:trHeight w:val="760" w:hRule="atLeast"/>
+          <w:trHeight w:val="620" w:hRule="atLeast"/>
         </w:trPr>
         <w:tc>
           <w:tcPr>
@@ -10661,7 +10977,7 @@
       </w:tblGrid>
       <w:tr>
         <w:trPr>
-          <w:trHeight w:val="760" w:hRule="atLeast"/>
+          <w:trHeight w:val="620" w:hRule="atLeast"/>
         </w:trPr>
         <w:tc>
           <w:tcPr>
@@ -10940,6 +11256,7 @@
       <w:pPr>
         <w:pStyle w:val="Heading1"/>
         <w:keepNext/>
+        <w:pageBreakBefore/>
         <w:pBdr>
           <w:bottom w:val="single" w:color="1E3A8A" w:sz="8" w:space="6"/>
         </w:pBdr>
@@ -11023,6 +11340,8 @@
           </w:tcPr>
           <w:p>
             <w:pPr>
+              <w:keepNext/>
+              <w:keepLines/>
               <w:spacing w:after="0"/>
               <w:jc w:val="left"/>
             </w:pPr>
@@ -11058,6 +11377,8 @@
           </w:tcPr>
           <w:p>
             <w:pPr>
+              <w:keepNext/>
+              <w:keepLines/>
               <w:spacing w:after="0"/>
               <w:jc w:val="center"/>
             </w:pPr>
@@ -11093,6 +11414,8 @@
           </w:tcPr>
           <w:p>
             <w:pPr>
+              <w:keepNext/>
+              <w:keepLines/>
               <w:spacing w:after="0"/>
               <w:jc w:val="center"/>
             </w:pPr>
@@ -11128,6 +11451,8 @@
           </w:tcPr>
           <w:p>
             <w:pPr>
+              <w:keepNext/>
+              <w:keepLines/>
               <w:spacing w:after="0"/>
               <w:jc w:val="center"/>
             </w:pPr>
@@ -11163,6 +11488,8 @@
           </w:tcPr>
           <w:p>
             <w:pPr>
+              <w:keepNext/>
+              <w:keepLines/>
               <w:spacing w:after="0"/>
               <w:jc w:val="center"/>
             </w:pPr>
@@ -11202,6 +11529,8 @@
           </w:tcPr>
           <w:p>
             <w:pPr>
+              <w:keepNext/>
+              <w:keepLines/>
               <w:spacing w:after="0"/>
               <w:jc w:val="left"/>
             </w:pPr>
@@ -11236,6 +11565,8 @@
           </w:tcPr>
           <w:p>
             <w:pPr>
+              <w:keepNext/>
+              <w:keepLines/>
               <w:spacing w:after="0"/>
               <w:jc w:val="center"/>
             </w:pPr>
@@ -11271,6 +11602,8 @@
           </w:tcPr>
           <w:p>
             <w:pPr>
+              <w:keepNext/>
+              <w:keepLines/>
               <w:spacing w:after="0"/>
               <w:jc w:val="center"/>
             </w:pPr>
@@ -11318,6 +11651,8 @@
           </w:tcPr>
           <w:p>
             <w:pPr>
+              <w:keepNext/>
+              <w:keepLines/>
               <w:spacing w:after="0"/>
               <w:jc w:val="center"/>
             </w:pPr>
@@ -11365,6 +11700,8 @@
           </w:tcPr>
           <w:p>
             <w:pPr>
+              <w:keepNext/>
+              <w:keepLines/>
               <w:spacing w:after="0"/>
               <w:jc w:val="center"/>
             </w:pPr>
@@ -11416,6 +11753,8 @@
           </w:tcPr>
           <w:p>
             <w:pPr>
+              <w:keepNext/>
+              <w:keepLines/>
               <w:spacing w:after="0"/>
               <w:jc w:val="left"/>
             </w:pPr>
@@ -11464,6 +11803,8 @@
           </w:tcPr>
           <w:p>
             <w:pPr>
+              <w:keepNext/>
+              <w:keepLines/>
               <w:spacing w:after="0"/>
               <w:jc w:val="center"/>
             </w:pPr>
@@ -11511,6 +11852,8 @@
           </w:tcPr>
           <w:p>
             <w:pPr>
+              <w:keepNext/>
+              <w:keepLines/>
               <w:spacing w:after="0"/>
               <w:jc w:val="center"/>
             </w:pPr>
@@ -11558,6 +11901,8 @@
           </w:tcPr>
           <w:p>
             <w:pPr>
+              <w:keepNext/>
+              <w:keepLines/>
               <w:spacing w:after="0"/>
               <w:jc w:val="center"/>
             </w:pPr>
@@ -11605,6 +11950,8 @@
           </w:tcPr>
           <w:p>
             <w:pPr>
+              <w:keepNext/>
+              <w:keepLines/>
               <w:spacing w:after="0"/>
               <w:jc w:val="center"/>
             </w:pPr>
@@ -11656,6 +12003,8 @@
           </w:tcPr>
           <w:p>
             <w:pPr>
+              <w:keepNext/>
+              <w:keepLines/>
               <w:spacing w:after="0"/>
               <w:jc w:val="left"/>
             </w:pPr>
@@ -11704,6 +12053,8 @@
           </w:tcPr>
           <w:p>
             <w:pPr>
+              <w:keepNext/>
+              <w:keepLines/>
               <w:spacing w:after="0"/>
               <w:jc w:val="center"/>
             </w:pPr>
@@ -11751,6 +12102,8 @@
           </w:tcPr>
           <w:p>
             <w:pPr>
+              <w:keepNext/>
+              <w:keepLines/>
               <w:spacing w:after="0"/>
               <w:jc w:val="center"/>
             </w:pPr>
@@ -11798,6 +12151,8 @@
           </w:tcPr>
           <w:p>
             <w:pPr>
+              <w:keepNext/>
+              <w:keepLines/>
               <w:spacing w:after="0"/>
               <w:jc w:val="center"/>
             </w:pPr>
@@ -11845,6 +12200,8 @@
           </w:tcPr>
           <w:p>
             <w:pPr>
+              <w:keepNext/>
+              <w:keepLines/>
               <w:spacing w:after="0"/>
               <w:jc w:val="center"/>
             </w:pPr>
@@ -11896,6 +12253,8 @@
           </w:tcPr>
           <w:p>
             <w:pPr>
+              <w:keepNext/>
+              <w:keepLines/>
               <w:spacing w:after="0"/>
               <w:jc w:val="left"/>
             </w:pPr>
@@ -11944,6 +12303,8 @@
           </w:tcPr>
           <w:p>
             <w:pPr>
+              <w:keepNext/>
+              <w:keepLines/>
               <w:spacing w:after="0"/>
               <w:jc w:val="center"/>
             </w:pPr>
@@ -11991,6 +12352,8 @@
           </w:tcPr>
           <w:p>
             <w:pPr>
+              <w:keepNext/>
+              <w:keepLines/>
               <w:spacing w:after="0"/>
               <w:jc w:val="center"/>
             </w:pPr>
@@ -12038,6 +12401,8 @@
           </w:tcPr>
           <w:p>
             <w:pPr>
+              <w:keepNext/>
+              <w:keepLines/>
               <w:spacing w:after="0"/>
               <w:jc w:val="center"/>
             </w:pPr>
@@ -12085,6 +12450,8 @@
           </w:tcPr>
           <w:p>
             <w:pPr>
+              <w:keepNext/>
+              <w:keepLines/>
               <w:spacing w:after="0"/>
               <w:jc w:val="center"/>
             </w:pPr>
@@ -12136,6 +12503,8 @@
           </w:tcPr>
           <w:p>
             <w:pPr>
+              <w:keepNext/>
+              <w:keepLines/>
               <w:spacing w:after="0"/>
               <w:jc w:val="left"/>
             </w:pPr>
@@ -12184,6 +12553,8 @@
           </w:tcPr>
           <w:p>
             <w:pPr>
+              <w:keepNext/>
+              <w:keepLines/>
               <w:spacing w:after="0"/>
               <w:jc w:val="center"/>
             </w:pPr>
@@ -12231,6 +12602,8 @@
           </w:tcPr>
           <w:p>
             <w:pPr>
+              <w:keepNext/>
+              <w:keepLines/>
               <w:spacing w:after="0"/>
               <w:jc w:val="center"/>
             </w:pPr>
@@ -12278,6 +12651,8 @@
           </w:tcPr>
           <w:p>
             <w:pPr>
+              <w:keepNext/>
+              <w:keepLines/>
               <w:spacing w:after="0"/>
               <w:jc w:val="center"/>
             </w:pPr>
@@ -12325,6 +12700,8 @@
           </w:tcPr>
           <w:p>
             <w:pPr>
+              <w:keepNext/>
+              <w:keepLines/>
               <w:spacing w:after="0"/>
               <w:jc w:val="center"/>
             </w:pPr>
@@ -12376,6 +12753,8 @@
           </w:tcPr>
           <w:p>
             <w:pPr>
+              <w:keepNext/>
+              <w:keepLines/>
               <w:spacing w:after="0"/>
               <w:jc w:val="left"/>
             </w:pPr>
@@ -12424,6 +12803,8 @@
           </w:tcPr>
           <w:p>
             <w:pPr>
+              <w:keepNext/>
+              <w:keepLines/>
               <w:spacing w:after="0"/>
               <w:jc w:val="center"/>
             </w:pPr>
@@ -12471,6 +12852,8 @@
           </w:tcPr>
           <w:p>
             <w:pPr>
+              <w:keepNext/>
+              <w:keepLines/>
               <w:spacing w:after="0"/>
               <w:jc w:val="center"/>
             </w:pPr>
@@ -12518,6 +12901,8 @@
           </w:tcPr>
           <w:p>
             <w:pPr>
+              <w:keepNext/>
+              <w:keepLines/>
               <w:spacing w:after="0"/>
               <w:jc w:val="center"/>
             </w:pPr>
@@ -12565,6 +12950,8 @@
           </w:tcPr>
           <w:p>
             <w:pPr>
+              <w:keepNext/>
+              <w:keepLines/>
               <w:spacing w:after="0"/>
               <w:jc w:val="center"/>
             </w:pPr>
@@ -12616,6 +13003,8 @@
           </w:tcPr>
           <w:p>
             <w:pPr>
+              <w:keepNext/>
+              <w:keepLines/>
               <w:spacing w:after="0"/>
               <w:jc w:val="left"/>
             </w:pPr>
@@ -12664,6 +13053,8 @@
           </w:tcPr>
           <w:p>
             <w:pPr>
+              <w:keepNext/>
+              <w:keepLines/>
               <w:spacing w:after="0"/>
               <w:jc w:val="center"/>
             </w:pPr>
@@ -12711,6 +13102,8 @@
           </w:tcPr>
           <w:p>
             <w:pPr>
+              <w:keepNext/>
+              <w:keepLines/>
               <w:spacing w:after="0"/>
               <w:jc w:val="center"/>
             </w:pPr>
@@ -12758,6 +13151,8 @@
           </w:tcPr>
           <w:p>
             <w:pPr>
+              <w:keepNext/>
+              <w:keepLines/>
               <w:spacing w:after="0"/>
               <w:jc w:val="center"/>
             </w:pPr>
@@ -12805,6 +13200,8 @@
           </w:tcPr>
           <w:p>
             <w:pPr>
+              <w:keepNext/>
+              <w:keepLines/>
               <w:spacing w:after="0"/>
               <w:jc w:val="center"/>
             </w:pPr>
@@ -12856,6 +13253,8 @@
           </w:tcPr>
           <w:p>
             <w:pPr>
+              <w:keepNext/>
+              <w:keepLines/>
               <w:spacing w:after="0"/>
               <w:jc w:val="left"/>
             </w:pPr>
@@ -12890,6 +13289,8 @@
           </w:tcPr>
           <w:p>
             <w:pPr>
+              <w:keepNext/>
+              <w:keepLines/>
               <w:spacing w:after="0"/>
               <w:jc w:val="center"/>
             </w:pPr>
@@ -12925,6 +13326,8 @@
           </w:tcPr>
           <w:p>
             <w:pPr>
+              <w:keepNext/>
+              <w:keepLines/>
               <w:spacing w:after="0"/>
               <w:jc w:val="center"/>
             </w:pPr>
@@ -12972,6 +13375,8 @@
           </w:tcPr>
           <w:p>
             <w:pPr>
+              <w:keepNext/>
+              <w:keepLines/>
               <w:spacing w:after="0"/>
               <w:jc w:val="center"/>
             </w:pPr>
@@ -13019,6 +13424,8 @@
           </w:tcPr>
           <w:p>
             <w:pPr>
+              <w:keepNext/>
+              <w:keepLines/>
               <w:spacing w:after="0"/>
               <w:jc w:val="center"/>
             </w:pPr>
@@ -13070,6 +13477,8 @@
           </w:tcPr>
           <w:p>
             <w:pPr>
+              <w:keepNext w:val="false"/>
+              <w:keepLines/>
               <w:spacing w:after="0"/>
               <w:jc w:val="left"/>
             </w:pPr>
@@ -13104,6 +13513,8 @@
           </w:tcPr>
           <w:p>
             <w:pPr>
+              <w:keepNext w:val="false"/>
+              <w:keepLines/>
               <w:spacing w:after="0"/>
               <w:jc w:val="center"/>
             </w:pPr>
@@ -13139,6 +13550,8 @@
           </w:tcPr>
           <w:p>
             <w:pPr>
+              <w:keepNext w:val="false"/>
+              <w:keepLines/>
               <w:spacing w:after="0"/>
               <w:jc w:val="center"/>
             </w:pPr>
@@ -13186,6 +13599,8 @@
           </w:tcPr>
           <w:p>
             <w:pPr>
+              <w:keepNext w:val="false"/>
+              <w:keepLines/>
               <w:spacing w:after="0"/>
               <w:jc w:val="center"/>
             </w:pPr>
@@ -13233,6 +13648,8 @@
           </w:tcPr>
           <w:p>
             <w:pPr>
+              <w:keepNext w:val="false"/>
+              <w:keepLines/>
               <w:spacing w:after="0"/>
               <w:jc w:val="center"/>
             </w:pPr>
@@ -13295,7 +13712,7 @@
       </w:tblGrid>
       <w:tr>
         <w:trPr>
-          <w:trHeight w:val="1060" w:hRule="atLeast"/>
+          <w:trHeight w:val="880" w:hRule="atLeast"/>
         </w:trPr>
         <w:tc>
           <w:tcPr>
@@ -13423,38 +13840,94 @@
 
 <file path=word/footer1.xml><?xml version="1.0" encoding="utf-8"?>
 <w:ftr xmlns:wpc="http://schemas.microsoft.com/office/word/2010/wordprocessingCanvas" xmlns:mc="http://schemas.openxmlformats.org/markup-compatibility/2006" xmlns:o="urn:schemas-microsoft-com:office:office" xmlns:r="http://schemas.openxmlformats.org/officeDocument/2006/relationships" xmlns:m="http://schemas.openxmlformats.org/officeDocument/2006/math" xmlns:v="urn:schemas-microsoft-com:vml" xmlns:wp14="http://schemas.microsoft.com/office/word/2010/wordprocessingDrawing" xmlns:wp="http://schemas.openxmlformats.org/drawingml/2006/wordprocessingDrawing" xmlns:w10="urn:schemas-microsoft-com:office:word" xmlns:w="http://schemas.openxmlformats.org/wordprocessingml/2006/main" xmlns:w14="http://schemas.microsoft.com/office/word/2010/wordml" xmlns:w15="http://schemas.microsoft.com/office/word/2012/wordml" xmlns:wpg="http://schemas.microsoft.com/office/word/2010/wordprocessingGroup" xmlns:wpi="http://schemas.microsoft.com/office/word/2010/wordprocessingInk" xmlns:wne="http://schemas.microsoft.com/office/word/2006/wordml" xmlns:wps="http://schemas.microsoft.com/office/word/2010/wordprocessingShape">
-  <w:p>
-    <w:pPr>
-      <w:tabs>
-        <w:tab w:val="right" w:pos="9638"/>
-      </w:tabs>
-    </w:pPr>
-    <w:r>
-      <w:rPr>
-        <w:color w:val="64748B"/>
-        <w:sz w:val="15"/>
-        <w:szCs w:val="15"/>
-      </w:rPr>
-      <w:t xml:space="preserve">Wzór: Sport Space Pro · sportspacepro.pl · możesz go dowolnie zmieniać i używać w swojej firmie</w:t>
-    </w:r>
-    <w:r>
-      <w:rPr>
-        <w:color w:val="64748B"/>
-        <w:sz w:val="15"/>
-        <w:szCs w:val="15"/>
-      </w:rPr>
-      <w:t xml:space="preserve">	</w:t>
-      <w:fldChar w:fldCharType="begin"/>
-      <w:instrText xml:space="preserve">PAGE</w:instrText>
-      <w:fldChar w:fldCharType="separate"/>
-      <w:fldChar w:fldCharType="end"/>
-      <w:t xml:space="preserve"> / </w:t>
-      <w:fldChar w:fldCharType="begin"/>
-      <w:instrText xml:space="preserve">NUMPAGES</w:instrText>
-      <w:fldChar w:fldCharType="separate"/>
-      <w:fldChar w:fldCharType="end"/>
-    </w:r>
-  </w:p>
+  <w:tbl>
+    <w:tblPr>
+      <w:tblW w:type="dxa" w:w="9638"/>
+      <w:tblBorders>
+        <w:top w:val="single" w:color="auto" w:sz="4"/>
+        <w:left w:val="single" w:color="auto" w:sz="4"/>
+        <w:bottom w:val="single" w:color="auto" w:sz="4"/>
+        <w:right w:val="single" w:color="auto" w:sz="4"/>
+        <w:insideH w:val="single" w:color="auto" w:sz="4"/>
+        <w:insideV w:val="single" w:color="auto" w:sz="4"/>
+      </w:tblBorders>
+    </w:tblPr>
+    <w:tblGrid>
+      <w:gridCol w:w="6361"/>
+      <w:gridCol w:w="3277"/>
+    </w:tblGrid>
+    <w:tr>
+      <w:tc>
+        <w:tcPr>
+          <w:tcW w:type="dxa" w:w="6361"/>
+          <w:tcBorders>
+            <w:top w:val="none" w:color="FFFFFF" w:sz="0"/>
+            <w:left w:val="none" w:color="FFFFFF" w:sz="0"/>
+            <w:bottom w:val="none" w:color="FFFFFF" w:sz="0"/>
+            <w:right w:val="none" w:color="FFFFFF" w:sz="0"/>
+          </w:tcBorders>
+          <w:tcMar>
+            <w:top w:type="dxa" w:w="0"/>
+            <w:left w:type="dxa" w:w="0"/>
+            <w:bottom w:type="dxa" w:w="0"/>
+            <w:right w:type="dxa" w:w="0"/>
+          </w:tcMar>
+          <w:vAlign w:val="center"/>
+        </w:tcPr>
+        <w:p>
+          <w:pPr>
+            <w:spacing w:after="0"/>
+            <w:jc w:val="left"/>
+          </w:pPr>
+          <w:r>
+            <w:rPr>
+              <w:color w:val="64748B"/>
+              <w:sz w:val="15"/>
+              <w:szCs w:val="15"/>
+            </w:rPr>
+            <w:t xml:space="preserve">Wzór: Sport Space Pro · sportspacepro.pl · możesz go dowolnie zmieniać i używać</w:t>
+          </w:r>
+        </w:p>
+      </w:tc>
+      <w:tc>
+        <w:tcPr>
+          <w:tcW w:type="dxa" w:w="3277"/>
+          <w:tcBorders>
+            <w:top w:val="none" w:color="FFFFFF" w:sz="0"/>
+            <w:left w:val="none" w:color="FFFFFF" w:sz="0"/>
+            <w:bottom w:val="none" w:color="FFFFFF" w:sz="0"/>
+            <w:right w:val="none" w:color="FFFFFF" w:sz="0"/>
+          </w:tcBorders>
+          <w:tcMar>
+            <w:top w:type="dxa" w:w="0"/>
+            <w:left w:type="dxa" w:w="0"/>
+            <w:bottom w:type="dxa" w:w="0"/>
+            <w:right w:type="dxa" w:w="0"/>
+          </w:tcMar>
+          <w:vAlign w:val="center"/>
+        </w:tcPr>
+        <w:p>
+          <w:pPr>
+            <w:spacing w:after="0"/>
+            <w:jc w:val="right"/>
+          </w:pPr>
+          <w:r>
+            <w:rPr>
+              <w:color w:val="64748B"/>
+              <w:sz w:val="15"/>
+              <w:szCs w:val="15"/>
+            </w:rPr>
+            <w:t xml:space="preserve">Strona </w:t>
+            <w:fldChar w:fldCharType="begin"/>
+            <w:instrText xml:space="preserve">PAGE</w:instrText>
+            <w:fldChar w:fldCharType="separate"/>
+            <w:t>1</w:t>
+            <w:fldChar w:fldCharType="end"/>
+          </w:r>
+        </w:p>
+      </w:tc>
+    </w:tr>
+  </w:tbl>
 </w:ftr>
 </file>
 
@@ -13497,73 +13970,135 @@
 
 <file path=word/header1.xml><?xml version="1.0" encoding="utf-8"?>
 <w:hdr xmlns:wpc="http://schemas.microsoft.com/office/word/2010/wordprocessingCanvas" xmlns:mc="http://schemas.openxmlformats.org/markup-compatibility/2006" xmlns:o="urn:schemas-microsoft-com:office:office" xmlns:r="http://schemas.openxmlformats.org/officeDocument/2006/relationships" xmlns:m="http://schemas.openxmlformats.org/officeDocument/2006/math" xmlns:v="urn:schemas-microsoft-com:vml" xmlns:wp14="http://schemas.microsoft.com/office/word/2010/wordprocessingDrawing" xmlns:wp="http://schemas.openxmlformats.org/drawingml/2006/wordprocessingDrawing" xmlns:w10="urn:schemas-microsoft-com:office:word" xmlns:w="http://schemas.openxmlformats.org/wordprocessingml/2006/main" xmlns:w14="http://schemas.microsoft.com/office/word/2010/wordml" xmlns:w15="http://schemas.microsoft.com/office/word/2012/wordml" xmlns:wpg="http://schemas.microsoft.com/office/word/2010/wordprocessingGroup" xmlns:wpi="http://schemas.microsoft.com/office/word/2010/wordprocessingInk" xmlns:wne="http://schemas.microsoft.com/office/word/2006/wordml" xmlns:wps="http://schemas.microsoft.com/office/word/2010/wordprocessingShape" xmlns:cx="http://schemas.microsoft.com/office/drawing/2014/chartex" xmlns:cx1="http://schemas.microsoft.com/office/drawing/2015/9/8/chartex" xmlns:cx2="http://schemas.microsoft.com/office/drawing/2015/10/21/chartex" xmlns:cx3="http://schemas.microsoft.com/office/drawing/2016/5/9/chartex" xmlns:cx4="http://schemas.microsoft.com/office/drawing/2016/5/10/chartex" xmlns:cx5="http://schemas.microsoft.com/office/drawing/2016/5/11/chartex" xmlns:cx6="http://schemas.microsoft.com/office/drawing/2016/5/12/chartex" xmlns:cx7="http://schemas.microsoft.com/office/drawing/2016/5/13/chartex" xmlns:cx8="http://schemas.microsoft.com/office/drawing/2016/5/14/chartex" xmlns:w16cid="http://schemas.microsoft.com/office/word/2016/wordml/cid" xmlns:w16se="http://schemas.microsoft.com/office/word/2015/wordml/symex">
+  <w:tbl>
+    <w:tblPr>
+      <w:tblW w:type="dxa" w:w="9638"/>
+      <w:tblBorders>
+        <w:top w:val="single" w:color="auto" w:sz="4"/>
+        <w:left w:val="single" w:color="auto" w:sz="4"/>
+        <w:bottom w:val="single" w:color="auto" w:sz="4"/>
+        <w:right w:val="single" w:color="auto" w:sz="4"/>
+        <w:insideH w:val="single" w:color="auto" w:sz="4"/>
+        <w:insideV w:val="single" w:color="auto" w:sz="4"/>
+      </w:tblBorders>
+    </w:tblPr>
+    <w:tblGrid>
+      <w:gridCol w:w="6361"/>
+      <w:gridCol w:w="3277"/>
+    </w:tblGrid>
+    <w:tr>
+      <w:tc>
+        <w:tcPr>
+          <w:tcW w:type="dxa" w:w="6361"/>
+          <w:tcBorders>
+            <w:top w:val="none" w:color="FFFFFF" w:sz="0"/>
+            <w:left w:val="none" w:color="FFFFFF" w:sz="0"/>
+            <w:bottom w:val="single" w:color="DBE5F1" w:sz="4"/>
+            <w:right w:val="none" w:color="FFFFFF" w:sz="0"/>
+          </w:tcBorders>
+          <w:tcMar>
+            <w:top w:type="dxa" w:w="0"/>
+            <w:left w:type="dxa" w:w="0"/>
+            <w:bottom w:type="dxa" w:w="80"/>
+            <w:right w:type="dxa" w:w="0"/>
+          </w:tcMar>
+          <w:vAlign w:val="center"/>
+        </w:tcPr>
+        <w:p>
+          <w:pPr>
+            <w:spacing w:after="0"/>
+            <w:jc w:val="left"/>
+          </w:pPr>
+          <w:r>
+            <w:drawing>
+              <wp:inline distT="0" distB="0" distL="0" distR="0">
+                <wp:extent cx="209550" cy="209550"/>
+                <wp:effectExtent t="0" r="0" b="0" l="0"/>
+                <wp:docPr id="1" name="" descr="" title=""/>
+                <wp:cNvGraphicFramePr>
+                  <a:graphicFrameLocks xmlns:a="http://schemas.openxmlformats.org/drawingml/2006/main" noChangeAspect="1"/>
+                </wp:cNvGraphicFramePr>
+                <a:graphic xmlns:a="http://schemas.openxmlformats.org/drawingml/2006/main">
+                  <a:graphicData uri="http://schemas.openxmlformats.org/drawingml/2006/picture">
+                    <pic:pic xmlns:pic="http://schemas.openxmlformats.org/drawingml/2006/picture">
+                      <pic:nvPicPr>
+                        <pic:cNvPr id="0" name="" descr=""/>
+                        <pic:cNvPicPr>
+                          <a:picLocks noChangeAspect="1" noChangeArrowheads="1"/>
+                        </pic:cNvPicPr>
+                      </pic:nvPicPr>
+                      <pic:blipFill>
+                        <a:blip r:embed="rId0" cstate="none"/>
+                        <a:srcRect/>
+                        <a:stretch>
+                          <a:fillRect/>
+                        </a:stretch>
+                      </pic:blipFill>
+                      <pic:spPr bwMode="auto">
+                        <a:xfrm>
+                          <a:off x="0" y="0"/>
+                          <a:ext cx="209550" cy="209550"/>
+                        </a:xfrm>
+                        <a:prstGeom prst="rect">
+                          <a:avLst/>
+                        </a:prstGeom>
+                      </pic:spPr>
+                    </pic:pic>
+                  </a:graphicData>
+                </a:graphic>
+              </wp:inline>
+            </w:drawing>
+          </w:r>
+          <w:r>
+            <w:rPr>
+              <w:b/>
+              <w:bCs/>
+              <w:color w:val="0B1736"/>
+              <w:sz w:val="18"/>
+              <w:szCs w:val="18"/>
+            </w:rPr>
+            <w:t xml:space="preserve">   Sport Space Pro</w:t>
+          </w:r>
+        </w:p>
+      </w:tc>
+      <w:tc>
+        <w:tcPr>
+          <w:tcW w:type="dxa" w:w="3277"/>
+          <w:tcBorders>
+            <w:top w:val="none" w:color="FFFFFF" w:sz="0"/>
+            <w:left w:val="none" w:color="FFFFFF" w:sz="0"/>
+            <w:bottom w:val="single" w:color="DBE5F1" w:sz="4"/>
+            <w:right w:val="none" w:color="FFFFFF" w:sz="0"/>
+          </w:tcBorders>
+          <w:tcMar>
+            <w:top w:type="dxa" w:w="0"/>
+            <w:left w:type="dxa" w:w="0"/>
+            <w:bottom w:type="dxa" w:w="80"/>
+            <w:right w:type="dxa" w:w="0"/>
+          </w:tcMar>
+          <w:vAlign w:val="center"/>
+        </w:tcPr>
+        <w:p>
+          <w:pPr>
+            <w:spacing w:after="0"/>
+            <w:jc w:val="right"/>
+          </w:pPr>
+          <w:r>
+            <w:rPr>
+              <w:color w:val="64748B"/>
+              <w:sz w:val="16"/>
+              <w:szCs w:val="16"/>
+            </w:rPr>
+            <w:t xml:space="preserve">Brief sponsoringowy marki</w:t>
+          </w:r>
+        </w:p>
+      </w:tc>
+    </w:tr>
+  </w:tbl>
   <w:p>
     <w:pPr>
-      <w:pBdr>
-        <w:bottom w:val="single" w:color="DBE5F1" w:sz="4" w:space="6"/>
-      </w:pBdr>
-      <w:tabs>
-        <w:tab w:val="right" w:pos="9638"/>
-      </w:tabs>
+      <w:spacing w:after="0"/>
     </w:pPr>
-    <w:r>
-      <w:drawing>
-        <wp:inline distT="0" distB="0" distL="0" distR="0">
-          <wp:extent cx="209550" cy="209550"/>
-          <wp:effectExtent t="0" r="0" b="0" l="0"/>
-          <wp:docPr id="1" name="" descr="" title=""/>
-          <wp:cNvGraphicFramePr>
-            <a:graphicFrameLocks xmlns:a="http://schemas.openxmlformats.org/drawingml/2006/main" noChangeAspect="1"/>
-          </wp:cNvGraphicFramePr>
-          <a:graphic xmlns:a="http://schemas.openxmlformats.org/drawingml/2006/main">
-            <a:graphicData uri="http://schemas.openxmlformats.org/drawingml/2006/picture">
-              <pic:pic xmlns:pic="http://schemas.openxmlformats.org/drawingml/2006/picture">
-                <pic:nvPicPr>
-                  <pic:cNvPr id="0" name="" descr=""/>
-                  <pic:cNvPicPr>
-                    <a:picLocks noChangeAspect="1" noChangeArrowheads="1"/>
-                  </pic:cNvPicPr>
-                </pic:nvPicPr>
-                <pic:blipFill>
-                  <a:blip r:embed="rId0" cstate="none"/>
-                  <a:srcRect/>
-                  <a:stretch>
-                    <a:fillRect/>
-                  </a:stretch>
-                </pic:blipFill>
-                <pic:spPr bwMode="auto">
-                  <a:xfrm>
-                    <a:off x="0" y="0"/>
-                    <a:ext cx="209550" cy="209550"/>
-                  </a:xfrm>
-                  <a:prstGeom prst="rect">
-                    <a:avLst/>
-                  </a:prstGeom>
-                </pic:spPr>
-              </pic:pic>
-            </a:graphicData>
-          </a:graphic>
-        </wp:inline>
-      </w:drawing>
-    </w:r>
-    <w:r>
-      <w:rPr>
-        <w:b/>
-        <w:bCs/>
-        <w:color w:val="0B1736"/>
-        <w:sz w:val="18"/>
-        <w:szCs w:val="18"/>
-      </w:rPr>
-      <w:t xml:space="preserve">  Sport Space Pro</w:t>
-    </w:r>
-    <w:r>
-      <w:rPr>
-        <w:color w:val="64748B"/>
-        <w:sz w:val="16"/>
-        <w:szCs w:val="16"/>
-      </w:rPr>
-      <w:t xml:space="preserve">	Brief sponsoringowy marki</w:t>
-    </w:r>
   </w:p>
 </w:hdr>
 </file>

</xml_diff>